<commit_message>
feat: Refine regression analysis and data selection in R scripts, update final paper and tables, and consolidate document structure.
</commit_message>
<xml_diff>
--- a/Final Tables.docx
+++ b/Final Tables.docx
@@ -2351,43 +2351,7 @@
                 <w:sz w:val="22"/>
                 <w:szCs w:val="22"/>
               </w:rPr>
-              <w:t>Miscellaneous revenue from other sources (</w:t>
-            </w:r>
-            <w:proofErr w:type="gramStart"/>
-            <w:r>
-              <w:rPr>
-                <w:color w:val="000000"/>
-                <w:sz w:val="22"/>
-                <w:szCs w:val="22"/>
-              </w:rPr>
-              <w:t>i.e.</w:t>
-            </w:r>
-            <w:proofErr w:type="gramEnd"/>
-            <w:r>
-              <w:rPr>
-                <w:color w:val="000000"/>
-                <w:sz w:val="22"/>
-                <w:szCs w:val="22"/>
-              </w:rPr>
-              <w:t xml:space="preserve"> sale of property, </w:t>
-            </w:r>
-            <w:proofErr w:type="gramStart"/>
-            <w:r>
-              <w:rPr>
-                <w:color w:val="000000"/>
-                <w:sz w:val="22"/>
-                <w:szCs w:val="22"/>
-              </w:rPr>
-              <w:t>etc.</w:t>
-            </w:r>
-            <w:proofErr w:type="gramEnd"/>
-            <w:r>
-              <w:rPr>
-                <w:color w:val="000000"/>
-                <w:sz w:val="22"/>
-                <w:szCs w:val="22"/>
-              </w:rPr>
-              <w:t>)</w:t>
+              <w:t>Miscellaneous revenue from other sources (i.e. sale of property, etc.)</w:t>
             </w:r>
             <w:r>
               <w:rPr>
@@ -2714,25 +2678,7 @@
                 <w:sz w:val="22"/>
                 <w:szCs w:val="22"/>
               </w:rPr>
-              <w:t xml:space="preserve">Total expenses directed towards programs. </w:t>
-            </w:r>
-            <w:proofErr w:type="gramStart"/>
-            <w:r>
-              <w:rPr>
-                <w:color w:val="000000"/>
-                <w:sz w:val="22"/>
-                <w:szCs w:val="22"/>
-              </w:rPr>
-              <w:t>Represents</w:t>
-            </w:r>
-            <w:proofErr w:type="gramEnd"/>
-            <w:r>
-              <w:rPr>
-                <w:color w:val="000000"/>
-                <w:sz w:val="22"/>
-                <w:szCs w:val="22"/>
-              </w:rPr>
-              <w:t xml:space="preserve"> the demand for the organization's services.</w:t>
+              <w:t>Total expenses directed towards programs. Represents the demand for the organization's services.</w:t>
             </w:r>
           </w:p>
         </w:tc>
@@ -3052,25 +2998,7 @@
                 <w:sz w:val="22"/>
                 <w:szCs w:val="22"/>
               </w:rPr>
-              <w:t xml:space="preserve">Total revenue from all sources. </w:t>
-            </w:r>
-            <w:proofErr w:type="gramStart"/>
-            <w:r>
-              <w:rPr>
-                <w:color w:val="000000"/>
-                <w:sz w:val="22"/>
-                <w:szCs w:val="22"/>
-              </w:rPr>
-              <w:t>Represents</w:t>
-            </w:r>
-            <w:proofErr w:type="gramEnd"/>
-            <w:r>
-              <w:rPr>
-                <w:color w:val="000000"/>
-                <w:sz w:val="22"/>
-                <w:szCs w:val="22"/>
-              </w:rPr>
-              <w:t xml:space="preserve"> the supply of the organization's services.</w:t>
+              <w:t>Total revenue from all sources. Represents the supply of the organization's services.</w:t>
             </w:r>
           </w:p>
         </w:tc>
@@ -4308,18 +4236,8 @@
                 <w:sz w:val="22"/>
                 <w:szCs w:val="22"/>
               </w:rPr>
-              <w:t xml:space="preserve">State where the organization is </w:t>
-            </w:r>
-            <w:proofErr w:type="gramStart"/>
-            <w:r>
-              <w:rPr>
-                <w:color w:val="000000"/>
-                <w:sz w:val="22"/>
-                <w:szCs w:val="22"/>
-              </w:rPr>
-              <w:t>located</w:t>
-            </w:r>
-            <w:proofErr w:type="gramEnd"/>
+              <w:t>State where the organization is located</w:t>
+            </w:r>
             <w:r>
               <w:rPr>
                 <w:sz w:val="22"/>
@@ -4891,27 +4809,7 @@
                 <w:sz w:val="22"/>
                 <w:szCs w:val="22"/>
               </w:rPr>
-              <w:t xml:space="preserve">* Observations for categorical variables </w:t>
-            </w:r>
-            <w:proofErr w:type="gramStart"/>
-            <w:r>
-              <w:rPr>
-                <w:rFonts w:eastAsia="Helvetica"/>
-                <w:color w:val="000000"/>
-                <w:sz w:val="22"/>
-                <w:szCs w:val="22"/>
-              </w:rPr>
-              <w:t>represent</w:t>
-            </w:r>
-            <w:proofErr w:type="gramEnd"/>
-            <w:r>
-              <w:rPr>
-                <w:rFonts w:eastAsia="Helvetica"/>
-                <w:color w:val="000000"/>
-                <w:sz w:val="22"/>
-                <w:szCs w:val="22"/>
-              </w:rPr>
-              <w:t xml:space="preserve"> unique counts.</w:t>
+              <w:t>* Observations for categorical variables represent unique counts.</w:t>
             </w:r>
           </w:p>
         </w:tc>
@@ -6830,23 +6728,13 @@
                 <w:szCs w:val="22"/>
               </w:rPr>
             </w:pPr>
-            <w:proofErr w:type="gramStart"/>
-            <w:r>
-              <w:rPr>
-                <w:color w:val="000000"/>
-                <w:sz w:val="22"/>
-                <w:szCs w:val="22"/>
-              </w:rPr>
-              <w:t>Log(</w:t>
-            </w:r>
-            <w:proofErr w:type="gramEnd"/>
-            <w:r>
-              <w:rPr>
-                <w:color w:val="000000"/>
-                <w:sz w:val="22"/>
-                <w:szCs w:val="22"/>
-              </w:rPr>
-              <w:t>Revenue)</w:t>
+            <w:r>
+              <w:rPr>
+                <w:color w:val="000000"/>
+                <w:sz w:val="22"/>
+                <w:szCs w:val="22"/>
+              </w:rPr>
+              <w:t>Log(Revenue)</w:t>
             </w:r>
           </w:p>
         </w:tc>
@@ -9817,15 +9705,7 @@
         <w:t>Then discussion of the economic relevance / importance of the preliminary results. Transition to why</w:t>
       </w:r>
       <w:r>
-        <w:t xml:space="preserve"> explanatory variables </w:t>
-      </w:r>
-      <w:proofErr w:type="gramStart"/>
-      <w:r>
-        <w:t>are needed</w:t>
-      </w:r>
-      <w:proofErr w:type="gramEnd"/>
-      <w:r>
-        <w:t xml:space="preserve"> to better strengthen the effect / correlation. </w:t>
+        <w:t xml:space="preserve"> explanatory variables are needed to better strengthen the effect / correlation. </w:t>
       </w:r>
     </w:p>
     <w:p/>
@@ -9842,16 +9722,11 @@
     </w:p>
     <w:p>
       <w:r>
-        <w:t xml:space="preserve">Then, explanatory variables experiment. Show the specific forms of revenue that </w:t>
-      </w:r>
-      <w:proofErr w:type="gramStart"/>
-      <w:r>
-        <w:t xml:space="preserve">are </w:t>
+        <w:t xml:space="preserve">Then, explanatory variables experiment. Show the specific forms of revenue that are </w:t>
       </w:r>
       <w:r>
         <w:t>affected</w:t>
       </w:r>
-      <w:proofErr w:type="gramEnd"/>
       <w:r>
         <w:t xml:space="preserve"> by the cyclical effect.</w:t>
       </w:r>
@@ -16499,15 +16374,7 @@
         <w:t xml:space="preserve">Then, </w:t>
       </w:r>
       <w:r>
-        <w:t xml:space="preserve">heterogeneity analysis of revenue controlled. Across revenue sizes and then industry. (though the order </w:t>
-      </w:r>
-      <w:proofErr w:type="gramStart"/>
-      <w:r>
-        <w:t>doesn’t</w:t>
-      </w:r>
-      <w:proofErr w:type="gramEnd"/>
-      <w:r>
-        <w:t xml:space="preserve"> matter that much). </w:t>
+        <w:t xml:space="preserve">heterogeneity analysis of revenue controlled. Across revenue sizes and then industry. (though the order doesn’t matter that much). </w:t>
       </w:r>
       <w:r>
         <w:t xml:space="preserve">Show that not all industries nor sizes are </w:t>
@@ -28553,23 +28420,13 @@
                 <w:szCs w:val="22"/>
               </w:rPr>
             </w:pPr>
-            <w:proofErr w:type="gramStart"/>
-            <w:r>
-              <w:rPr>
-                <w:color w:val="000000"/>
-                <w:sz w:val="22"/>
-                <w:szCs w:val="22"/>
-              </w:rPr>
-              <w:t>Log(</w:t>
-            </w:r>
-            <w:proofErr w:type="gramEnd"/>
-            <w:r>
-              <w:rPr>
-                <w:color w:val="000000"/>
-                <w:sz w:val="22"/>
-                <w:szCs w:val="22"/>
-              </w:rPr>
-              <w:t>Revenue)</w:t>
+            <w:r>
+              <w:rPr>
+                <w:color w:val="000000"/>
+                <w:sz w:val="22"/>
+                <w:szCs w:val="22"/>
+              </w:rPr>
+              <w:t>Log(Revenue)</w:t>
             </w:r>
           </w:p>
         </w:tc>

</xml_diff>